<commit_message>
Immobilien: Beiblatt-Grafik für Verkäufer-Anschreiben
Co-Authored-By: Claude Opus 5.5 <noreply@anthropic.com>
Claude-Session: https://claude.ai/code/session_01TfKgm1RZ1GZy99PVBodeCF
</commit_message>
<xml_diff>
--- a/immobilien/Anschreiben_Verkaeufer_Damme.docx
+++ b/immobilien/Anschreiben_Verkaeufer_Damme.docx
@@ -609,9 +609,64 @@
         <w:t xml:space="preserve">[Vorname Nachname]</w:t>
       </w:r>
     </w:p>
+    <w:p>
+      <w:pPr>
+        <w:sectPr>
+          <w:pgSz w:w="11906" w:h="16838" w:orient="portrait"/>
+          <w:pgMar w:top="1000" w:right="1134" w:bottom="850" w:left="1418" w:header="708" w:footer="708" w:gutter="0"/>
+          <w:pgNumType/>
+          <w:docGrid w:linePitch="360"/>
+        </w:sectPr>
+      </w:pPr>
+    </w:p>
+    <w:p>
+      <w:pPr>
+        <w:spacing w:after="0"/>
+      </w:pPr>
+      <w:r>
+        <w:drawing>
+          <wp:inline distT="0" distB="0" distL="0" distR="0">
+            <wp:extent cx="7524750" cy="10639425"/>
+            <wp:effectExtent t="0" r="0" b="0" l="0"/>
+            <wp:docPr id="1" name="" descr="" title=""/>
+            <wp:cNvGraphicFramePr>
+              <a:graphicFrameLocks xmlns:a="http://schemas.openxmlformats.org/drawingml/2006/main" noChangeAspect="1"/>
+            </wp:cNvGraphicFramePr>
+            <a:graphic xmlns:a="http://schemas.openxmlformats.org/drawingml/2006/main">
+              <a:graphicData uri="http://schemas.openxmlformats.org/drawingml/2006/picture">
+                <pic:pic xmlns:pic="http://schemas.openxmlformats.org/drawingml/2006/picture">
+                  <pic:nvPicPr>
+                    <pic:cNvPr id="0" name="" descr=""/>
+                    <pic:cNvPicPr>
+                      <a:picLocks noChangeAspect="1" noChangeArrowheads="1"/>
+                    </pic:cNvPicPr>
+                  </pic:nvPicPr>
+                  <pic:blipFill>
+                    <a:blip r:embed="rId7" cstate="none"/>
+                    <a:srcRect/>
+                    <a:stretch>
+                      <a:fillRect/>
+                    </a:stretch>
+                  </pic:blipFill>
+                  <pic:spPr bwMode="auto">
+                    <a:xfrm>
+                      <a:off x="0" y="0"/>
+                      <a:ext cx="7524750" cy="10639425"/>
+                    </a:xfrm>
+                    <a:prstGeom prst="rect">
+                      <a:avLst/>
+                    </a:prstGeom>
+                  </pic:spPr>
+                </pic:pic>
+              </a:graphicData>
+            </a:graphic>
+          </wp:inline>
+        </w:drawing>
+      </w:r>
+    </w:p>
     <w:sectPr>
       <w:pgSz w:w="11906" w:h="16838" w:orient="portrait"/>
-      <w:pgMar w:top="1000" w:right="1134" w:bottom="850" w:left="1418" w:header="708" w:footer="708" w:gutter="0"/>
+      <w:pgMar w:top="0" w:right="0" w:bottom="0" w:left="0" w:header="708" w:footer="708" w:gutter="0"/>
       <w:pgNumType/>
       <w:docGrid w:linePitch="360"/>
     </w:sectPr>

</xml_diff>

<commit_message>
Anschreiben und Beiblatt: klare Reparatur-Regel und Vertrauenspunkte
- Gebäude übernimmt der Käufer, Küche/Möbel/Geräte bleiben Eigentum des Verkäufers
- Kleinreparaturen über Mietvertrag, bekannte Mängel vor dem Kauf festhalten
- Gutachten, Familie willkommen, eigene Beratung, Vertragsentwurf 2 Wochen vorher, Bedenkzeit
- Anschreiben zusätzlich als PDF

Co-Authored-By: Claude Opus 5.5 <noreply@anthropic.com>
Claude-Session: https://claude.ai/code/session_01TfKgm1RZ1GZy99PVBodeCF
</commit_message>
<xml_diff>
--- a/immobilien/Anschreiben_Verkaeufer_Damme.docx
+++ b/immobilien/Anschreiben_Verkaeufer_Damme.docx
@@ -346,7 +346,7 @@
           <w:sz w:val="20"/>
           <w:szCs w:val="20"/>
         </w:rPr>
-        <w:t xml:space="preserve"> Ihre Nachbarn, Ihr Garten, Ihre gewohnte Umgebung – es ändert sich nichts. Ich verzichte vertraglich auf mein Kündigungsrecht; auf Wunsch sichern wir Ihr Wohnrecht zusätzlich im Grundbuch ab.</w:t>
+        <w:t xml:space="preserve"> Ihre Nachbarn, Ihr Garten, Ihre gewohnte Umgebung – es ändert sich nichts. Ich verzichte vertraglich auf mein Kündigungsrecht. Wie Sie zusätzlich abgesichert werden, besprechen wir gemeinsam mit dem Notar.</w:t>
       </w:r>
     </w:p>
     <w:p>
@@ -375,7 +375,7 @@
           <w:sz w:val="20"/>
           <w:szCs w:val="20"/>
         </w:rPr>
-        <w:t xml:space="preserve"> Statt im Haus „festzustecken“, steht Ihnen der Kaufpreis sofort zur Verfügung – für mehr Lebensqualität, Reisen, Unterstützung im Alter oder um Ihren Kindern und Enkeln schon heute zu helfen.</w:t>
+        <w:t xml:space="preserve"> Der Kaufpreis steht Ihnen sofort zur Verfügung – für mehr Lebensqualität, Unterstützung im Alter oder um Kindern und Enkeln schon heute zu helfen.</w:t>
       </w:r>
     </w:p>
     <w:p>
@@ -396,15 +396,15 @@
           <w:sz w:val="20"/>
           <w:szCs w:val="20"/>
         </w:rPr>
-        <w:t xml:space="preserve">Keine Sorgen mehr um Reparaturen.</w:t>
-      </w:r>
-      <w:r>
-        <w:rPr>
-          <w:rFonts w:ascii="Calibri" w:cs="Calibri" w:eastAsia="Calibri" w:hAnsi="Calibri"/>
-          <w:sz w:val="20"/>
-          <w:szCs w:val="20"/>
-        </w:rPr>
-        <w:t xml:space="preserve"> Dach, Heizung, Fenster oder neue gesetzliche Vorgaben zur Energieeffizienz – diese Kosten und die Organisation übernehme ich als Eigentümer.</w:t>
+        <w:t xml:space="preserve">Das Haus ist meine Aufgabe.</w:t>
+      </w:r>
+      <w:r>
+        <w:rPr>
+          <w:rFonts w:ascii="Calibri" w:cs="Calibri" w:eastAsia="Calibri" w:hAnsi="Calibri"/>
+          <w:sz w:val="20"/>
+          <w:szCs w:val="20"/>
+        </w:rPr>
+        <w:t xml:space="preserve"> Dach, Fassade, Fenster, Heizung, Leitungen und neue Energievorschriften übernehme ich als Eigentümer. Ihre Küche, Möbel und Haushaltsgeräte bleiben Ihr Eigentum – Sie entscheiden selbst, was Sie wann ersetzen. Kleine Reparaturen regelt der Mietvertrag. Bekannte Mängel halten wir vor dem Kauf gemeinsam fest, damit es später keine Überraschungen gibt.</w:t>
       </w:r>
     </w:p>
     <w:p>
@@ -425,15 +425,15 @@
           <w:sz w:val="20"/>
           <w:szCs w:val="20"/>
         </w:rPr>
-        <w:t xml:space="preserve">Das Geld reicht für die Miete – mit Reserve.</w:t>
-      </w:r>
-      <w:r>
-        <w:rPr>
-          <w:rFonts w:ascii="Calibri" w:cs="Calibri" w:eastAsia="Calibri" w:hAnsi="Calibri"/>
-          <w:sz w:val="20"/>
-          <w:szCs w:val="20"/>
-        </w:rPr>
-        <w:t xml:space="preserve"> Die Miete orientiert sich am örtlichen Mietspiegel. Schon ein kleiner Teil des Kaufpreises deckt sie für viele Jahre; der Rest bleibt für Sie und Ihre Familie.</w:t>
+        <w:t xml:space="preserve">Eine faire Miete.</w:t>
+      </w:r>
+      <w:r>
+        <w:rPr>
+          <w:rFonts w:ascii="Calibri" w:cs="Calibri" w:eastAsia="Calibri" w:hAnsi="Calibri"/>
+          <w:sz w:val="20"/>
+          <w:szCs w:val="20"/>
+        </w:rPr>
+        <w:t xml:space="preserve"> Die Miete richtet sich nach dem örtlichen Mietspiegel. In der Regel deckt schon ein Teil des Kaufpreises die Miete für viele Jahre.</w:t>
       </w:r>
     </w:p>
     <w:p>
@@ -462,7 +462,7 @@
           <w:sz w:val="20"/>
           <w:szCs w:val="20"/>
         </w:rPr>
-        <w:t xml:space="preserve"> Kein Exposé im Internet, keine fremden Menschen im Haus, keine Provision. Alles bleibt diskret zwischen uns.</w:t>
+        <w:t xml:space="preserve"> Kein Exposé im Internet, keine fremden Menschen im Haus, keine Provision.</w:t>
       </w:r>
     </w:p>
     <w:p>
@@ -483,15 +483,15 @@
           <w:sz w:val="20"/>
           <w:szCs w:val="20"/>
         </w:rPr>
-        <w:t xml:space="preserve">Fair und transparent.</w:t>
-      </w:r>
-      <w:r>
-        <w:rPr>
-          <w:rFonts w:ascii="Calibri" w:cs="Calibri" w:eastAsia="Calibri" w:hAnsi="Calibri"/>
-          <w:sz w:val="20"/>
-          <w:szCs w:val="20"/>
-        </w:rPr>
-        <w:t xml:space="preserve"> Der Preis richtet sich nach dem tatsächlichen Wert – gern auf Basis eines unabhängigen Gutachtens. Beziehen Sie Ihre Kinder oder eine Vertrauensperson ruhig von Anfang an ein. Der Vertrag wird selbstverständlich beim Notar geschlossen.</w:t>
+        <w:t xml:space="preserve">Fair und nachprüfbar.</w:t>
+      </w:r>
+      <w:r>
+        <w:rPr>
+          <w:rFonts w:ascii="Calibri" w:cs="Calibri" w:eastAsia="Calibri" w:hAnsi="Calibri"/>
+          <w:sz w:val="20"/>
+          <w:szCs w:val="20"/>
+        </w:rPr>
+        <w:t xml:space="preserve"> Der Preis richtet sich nach einem unabhängigen Gutachten. Ihre Kinder oder eine Vertrauensperson sind ausdrücklich willkommen, und ich empfehle Ihnen, sich auch selbst beraten zu lassen. Den Vertragsentwurf des Notars erhalten Sie mindestens zwei Wochen vor dem Termin.</w:t>
       </w:r>
     </w:p>
     <w:p>
@@ -512,15 +512,53 @@
           <w:sz w:val="20"/>
           <w:szCs w:val="20"/>
         </w:rPr>
-        <w:t xml:space="preserve">Ein fester Ansprechpartner vor Ort.</w:t>
-      </w:r>
-      <w:r>
-        <w:rPr>
-          <w:rFonts w:ascii="Calibri" w:cs="Calibri" w:eastAsia="Calibri" w:hAnsi="Calibri"/>
-          <w:sz w:val="20"/>
-          <w:szCs w:val="20"/>
-        </w:rPr>
-        <w:t xml:space="preserve"> Kein anonymer Konzern, sondern jemand aus Damme, der bei Fragen erreichbar ist und sich kümmert.</w:t>
+        <w:t xml:space="preserve">Sie haben alle Zeit der Welt.</w:t>
+      </w:r>
+      <w:r>
+        <w:rPr>
+          <w:rFonts w:ascii="Calibri" w:cs="Calibri" w:eastAsia="Calibri" w:hAnsi="Calibri"/>
+          <w:sz w:val="20"/>
+          <w:szCs w:val="20"/>
+        </w:rPr>
+        <w:t xml:space="preserve"> Kein Zeitdruck: Bis zum Notartermin können Sie jederzeit ohne Begründung Nein sagen.</w:t>
+      </w:r>
+    </w:p>
+    <w:p>
+      <w:pPr>
+        <w:pStyle w:val="ListParagraph"/>
+        <w:numPr>
+          <w:ilvl w:val="0"/>
+          <w:numId w:val="2"/>
+        </w:numPr>
+        <w:spacing w:after="70" w:line="259"/>
+      </w:pPr>
+      <w:r>
+        <w:rPr>
+          <w:rFonts w:ascii="Calibri" w:cs="Calibri" w:eastAsia="Calibri" w:hAnsi="Calibri"/>
+          <w:b/>
+          <w:bCs/>
+          <w:color w:val="7A2E1C"/>
+          <w:sz w:val="20"/>
+          <w:szCs w:val="20"/>
+        </w:rPr>
+        <w:t xml:space="preserve">Ein fester Ansprechpartner aus Damme.</w:t>
+      </w:r>
+      <w:r>
+        <w:rPr>
+          <w:rFonts w:ascii="Calibri" w:cs="Calibri" w:eastAsia="Calibri" w:hAnsi="Calibri"/>
+          <w:sz w:val="20"/>
+          <w:szCs w:val="20"/>
+        </w:rPr>
+        <w:t xml:space="preserve"> Kein anonymer Konzern, sondern jemand von hier, der erreichbar ist und sich kümmert. </w:t>
+      </w:r>
+      <w:r>
+        <w:rPr>
+          <w:rFonts w:ascii="Calibri" w:cs="Calibri" w:eastAsia="Calibri" w:hAnsi="Calibri"/>
+          <w:sz w:val="20"/>
+          <w:szCs w:val="20"/>
+          <w:shd w:fill="FFF1A8" w:color="auto" w:val="clear"/>
+        </w:rPr>
+        <w:t xml:space="preserve">[Optional, nur wenn zutreffend: Gern stelle ich Ihnen den Kontakt zu Familien her, mit denen ich bereits zusammenarbeite.]</w:t>
       </w:r>
     </w:p>
     <w:p>

</xml_diff>